<commit_message>
docs: update project report details in Laporan-Project.docx
</commit_message>
<xml_diff>
--- a/Laporan-Project.docx
+++ b/Laporan-Project.docx
@@ -9,12 +9,12 @@
       </w:pPr>
       <w:r>
         <w:rPr>
-          <w:rFonts w:ascii="Calibri" w:hAnsi="Calibri" w:eastAsia="ＭＳ ゴシック" w:cs="Calibri" w:asciiTheme="majorHAnsi" w:hAnsiTheme="majorHAnsi" w:eastAsiaTheme="majorEastAsia" w:csTheme="majorBidi"/>
+          <w:rFonts w:ascii="Calibri" w:hAnsi="Calibri" w:eastAsia="ＭＳ ゴシック" w:cs="Calibri" w:asciiTheme="majorHAnsi" w:hAnsiTheme="majorHAnsi" w:eastAsiaTheme="majorEastAsia"/>
           <w:color w:val="17365D" w:themeColor="text2" w:themeShade="BF"/>
           <w:spacing w:val="5"/>
           <w:kern w:val="28"/>
-          <w:sz w:val="52"/>
-          <w:szCs w:val="52"/>
+          <w:sz w:val="48"/>
+          <w:szCs w:val="48"/>
         </w:rPr>
         <w:t>LAPORAN PROJECT</w:t>
       </w:r>
@@ -25,7 +25,7 @@
       </w:pPr>
       <w:r>
         <w:rPr>
-          <w:rFonts w:ascii="Calibri" w:hAnsi="Calibri" w:eastAsia="ＭＳ 明朝" w:cs="Calibri" w:eastAsiaTheme="minorEastAsia" w:csTheme="minorBidi"/>
+          <w:rFonts w:ascii="Calibri" w:hAnsi="Calibri" w:eastAsia="ＭＳ 明朝" w:cs="Calibri" w:eastAsiaTheme="minorEastAsia"/>
           <w:b/>
           <w:bCs/>
           <w:sz w:val="24"/>
@@ -41,7 +41,7 @@
       </w:pPr>
       <w:r>
         <w:rPr>
-          <w:rFonts w:ascii="Calibri" w:hAnsi="Calibri" w:eastAsia="ＭＳ ゴシック" w:cs="Calibri" w:asciiTheme="majorHAnsi" w:hAnsiTheme="majorHAnsi" w:eastAsiaTheme="majorEastAsia" w:csTheme="majorBidi"/>
+          <w:rFonts w:ascii="Calibri" w:hAnsi="Calibri" w:eastAsia="ＭＳ ゴシック" w:cs="Calibri" w:asciiTheme="majorHAnsi" w:hAnsiTheme="majorHAnsi" w:eastAsiaTheme="majorEastAsia"/>
           <w:b/>
           <w:bCs/>
           <w:color w:val="365F91" w:themeColor="accent1" w:themeShade="BF"/>
@@ -58,7 +58,7 @@
       </w:pPr>
       <w:r>
         <w:rPr>
-          <w:rFonts w:ascii="Calibri" w:hAnsi="Calibri" w:eastAsia="ＭＳ 明朝" w:cs="Calibri" w:eastAsiaTheme="minorEastAsia" w:csTheme="minorBidi"/>
+          <w:rFonts w:ascii="Calibri" w:hAnsi="Calibri" w:eastAsia="ＭＳ 明朝" w:cs="Calibri" w:eastAsiaTheme="minorEastAsia"/>
           <w:sz w:val="22"/>
           <w:szCs w:val="22"/>
         </w:rPr>
@@ -72,7 +72,7 @@
       </w:pPr>
       <w:r>
         <w:rPr>
-          <w:rFonts w:ascii="Calibri" w:hAnsi="Calibri" w:eastAsia="ＭＳ 明朝" w:cs="Calibri" w:eastAsiaTheme="minorEastAsia" w:csTheme="minorBidi"/>
+          <w:rFonts w:ascii="Calibri" w:hAnsi="Calibri" w:eastAsia="ＭＳ 明朝" w:cs="Calibri" w:eastAsiaTheme="minorEastAsia"/>
           <w:sz w:val="22"/>
           <w:szCs w:val="22"/>
         </w:rPr>
@@ -86,7 +86,7 @@
       </w:pPr>
       <w:r>
         <w:rPr>
-          <w:rFonts w:ascii="Calibri" w:hAnsi="Calibri" w:eastAsia="ＭＳ 明朝" w:cs="Calibri" w:eastAsiaTheme="minorEastAsia" w:csTheme="minorBidi"/>
+          <w:rFonts w:ascii="Calibri" w:hAnsi="Calibri" w:eastAsia="ＭＳ 明朝" w:cs="Calibri" w:eastAsiaTheme="minorEastAsia"/>
           <w:sz w:val="22"/>
           <w:szCs w:val="22"/>
         </w:rPr>
@@ -100,7 +100,7 @@
       </w:pPr>
       <w:r>
         <w:rPr>
-          <w:rFonts w:ascii="Calibri" w:hAnsi="Calibri" w:eastAsia="ＭＳ 明朝" w:cs="Calibri" w:eastAsiaTheme="minorEastAsia" w:csTheme="minorBidi"/>
+          <w:rFonts w:ascii="Calibri" w:hAnsi="Calibri" w:eastAsia="ＭＳ 明朝" w:cs="Calibri" w:eastAsiaTheme="minorEastAsia"/>
           <w:sz w:val="22"/>
           <w:szCs w:val="22"/>
         </w:rPr>
@@ -114,7 +114,7 @@
       </w:pPr>
       <w:r>
         <w:rPr>
-          <w:rFonts w:ascii="Calibri" w:hAnsi="Calibri" w:eastAsia="ＭＳ ゴシック" w:cs="Calibri" w:asciiTheme="majorHAnsi" w:hAnsiTheme="majorHAnsi" w:eastAsiaTheme="majorEastAsia" w:csTheme="majorBidi"/>
+          <w:rFonts w:ascii="Calibri" w:hAnsi="Calibri" w:eastAsia="ＭＳ ゴシック" w:cs="Calibri" w:asciiTheme="majorHAnsi" w:hAnsiTheme="majorHAnsi" w:eastAsiaTheme="majorEastAsia"/>
           <w:b/>
           <w:bCs/>
           <w:color w:val="4F81BD" w:themeColor="accent1"/>
@@ -132,7 +132,7 @@
       </w:pPr>
       <w:r>
         <w:rPr>
-          <w:rFonts w:ascii="Calibri" w:hAnsi="Calibri" w:eastAsia="ＭＳ 明朝" w:cs="Calibri" w:eastAsiaTheme="minorEastAsia" w:csTheme="minorBidi"/>
+          <w:rFonts w:ascii="Calibri" w:hAnsi="Calibri" w:eastAsia="ＭＳ 明朝" w:cs="Calibri" w:eastAsiaTheme="minorEastAsia"/>
           <w:sz w:val="22"/>
           <w:szCs w:val="22"/>
         </w:rPr>
@@ -147,7 +147,7 @@
       </w:pPr>
       <w:r>
         <w:rPr>
-          <w:rFonts w:ascii="Calibri" w:hAnsi="Calibri" w:eastAsia="ＭＳ 明朝" w:cs="Calibri" w:eastAsiaTheme="minorEastAsia" w:csTheme="minorBidi"/>
+          <w:rFonts w:ascii="Calibri" w:hAnsi="Calibri" w:eastAsia="ＭＳ 明朝" w:cs="Calibri" w:eastAsiaTheme="minorEastAsia"/>
           <w:sz w:val="22"/>
           <w:szCs w:val="22"/>
         </w:rPr>
@@ -162,7 +162,7 @@
       </w:pPr>
       <w:r>
         <w:rPr>
-          <w:rFonts w:ascii="Calibri" w:hAnsi="Calibri" w:eastAsia="ＭＳ 明朝" w:cs="Calibri" w:eastAsiaTheme="minorEastAsia" w:csTheme="minorBidi"/>
+          <w:rFonts w:ascii="Calibri" w:hAnsi="Calibri" w:eastAsia="ＭＳ 明朝" w:cs="Calibri" w:eastAsiaTheme="minorEastAsia"/>
           <w:sz w:val="22"/>
           <w:szCs w:val="22"/>
         </w:rPr>
@@ -177,7 +177,7 @@
       </w:pPr>
       <w:r>
         <w:rPr>
-          <w:rFonts w:ascii="Calibri" w:hAnsi="Calibri" w:eastAsia="ＭＳ 明朝" w:cs="Calibri" w:eastAsiaTheme="minorEastAsia" w:csTheme="minorBidi"/>
+          <w:rFonts w:ascii="Calibri" w:hAnsi="Calibri" w:eastAsia="ＭＳ 明朝" w:cs="Calibri" w:eastAsiaTheme="minorEastAsia"/>
           <w:sz w:val="22"/>
           <w:szCs w:val="22"/>
         </w:rPr>
@@ -192,7 +192,7 @@
       </w:pPr>
       <w:r>
         <w:rPr>
-          <w:rFonts w:ascii="Calibri" w:hAnsi="Calibri" w:eastAsia="ＭＳ 明朝" w:cs="Calibri" w:eastAsiaTheme="minorEastAsia" w:csTheme="minorBidi"/>
+          <w:rFonts w:ascii="Calibri" w:hAnsi="Calibri" w:eastAsia="ＭＳ 明朝" w:cs="Calibri" w:eastAsiaTheme="minorEastAsia"/>
           <w:sz w:val="22"/>
           <w:szCs w:val="22"/>
         </w:rPr>
@@ -206,7 +206,7 @@
       </w:pPr>
       <w:r>
         <w:rPr>
-          <w:rFonts w:ascii="Calibri" w:hAnsi="Calibri" w:eastAsia="ＭＳ ゴシック" w:cs="Calibri" w:asciiTheme="majorHAnsi" w:hAnsiTheme="majorHAnsi" w:eastAsiaTheme="majorEastAsia" w:csTheme="majorBidi"/>
+          <w:rFonts w:ascii="Calibri" w:hAnsi="Calibri" w:eastAsia="ＭＳ ゴシック" w:cs="Calibri" w:asciiTheme="majorHAnsi" w:hAnsiTheme="majorHAnsi" w:eastAsiaTheme="majorEastAsia"/>
           <w:b/>
           <w:bCs/>
           <w:color w:val="4F81BD" w:themeColor="accent1"/>
@@ -223,7 +223,7 @@
       </w:pPr>
       <w:r>
         <w:rPr>
-          <w:rFonts w:ascii="Calibri" w:hAnsi="Calibri" w:eastAsia="ＭＳ 明朝" w:cs="Calibri" w:eastAsiaTheme="minorEastAsia" w:csTheme="minorBidi"/>
+          <w:rFonts w:ascii="Calibri" w:hAnsi="Calibri" w:eastAsia="ＭＳ 明朝" w:cs="Calibri" w:eastAsiaTheme="minorEastAsia"/>
           <w:sz w:val="22"/>
           <w:szCs w:val="22"/>
         </w:rPr>
@@ -237,7 +237,7 @@
       </w:pPr>
       <w:r>
         <w:rPr>
-          <w:rFonts w:ascii="Calibri" w:hAnsi="Calibri" w:eastAsia="ＭＳ ゴシック" w:cs="Calibri" w:asciiTheme="majorHAnsi" w:hAnsiTheme="majorHAnsi" w:eastAsiaTheme="majorEastAsia" w:csTheme="majorBidi"/>
+          <w:rFonts w:ascii="Calibri" w:hAnsi="Calibri" w:eastAsia="ＭＳ ゴシック" w:cs="Calibri" w:asciiTheme="majorHAnsi" w:hAnsiTheme="majorHAnsi" w:eastAsiaTheme="majorEastAsia"/>
           <w:b/>
           <w:bCs/>
           <w:color w:val="4F81BD" w:themeColor="accent1"/>
@@ -255,11 +255,11 @@
       </w:pPr>
       <w:r>
         <w:rPr>
-          <w:rFonts w:ascii="Calibri" w:hAnsi="Calibri" w:eastAsia="ＭＳ 明朝" w:cs="Calibri" w:eastAsiaTheme="minorEastAsia" w:csTheme="minorBidi"/>
+          <w:rFonts w:ascii="Calibri" w:hAnsi="Calibri" w:eastAsia="ＭＳ 明朝" w:cs="Calibri" w:eastAsiaTheme="minorEastAsia"/>
           <w:sz w:val="22"/>
           <w:szCs w:val="22"/>
         </w:rPr>
-        <w:t>Masalah 1 - Pembatasan input zona 0-5 (Ketentuan 2 &amp; 4). Tanpa pembatasan, pengguna dapat memasukkan nilai di luar rentang yang merusak perhitungan, sehingga melanggar spesifikasi zona.</w:t>
+        <w:t>Masalah 1 - Pembatasan input zona 0-5 (Ketentuan 2 &amp; 4). Tanpa pembatasan, pengguna dapat memasukkan nilai di luar rentang yang merusak perhitungan</w:t>
       </w:r>
     </w:p>
     <w:p>
@@ -270,7 +270,7 @@
       </w:pPr>
       <w:r>
         <w:rPr>
-          <w:rFonts w:ascii="Calibri" w:hAnsi="Calibri" w:eastAsia="ＭＳ 明朝" w:cs="Calibri" w:eastAsiaTheme="minorEastAsia" w:csTheme="minorBidi"/>
+          <w:rFonts w:ascii="Calibri" w:hAnsi="Calibri" w:eastAsia="ＭＳ 明朝" w:cs="Calibri" w:eastAsiaTheme="minorEastAsia"/>
           <w:sz w:val="22"/>
           <w:szCs w:val="22"/>
         </w:rPr>
@@ -285,7 +285,7 @@
       </w:pPr>
       <w:r>
         <w:rPr>
-          <w:rFonts w:ascii="Calibri" w:hAnsi="Calibri" w:eastAsia="ＭＳ 明朝" w:cs="Calibri" w:eastAsiaTheme="minorEastAsia" w:csTheme="minorBidi"/>
+          <w:rFonts w:ascii="Calibri" w:hAnsi="Calibri" w:eastAsia="ＭＳ 明朝" w:cs="Calibri" w:eastAsiaTheme="minorEastAsia"/>
           <w:sz w:val="22"/>
           <w:szCs w:val="22"/>
         </w:rPr>
@@ -300,7 +300,7 @@
       </w:pPr>
       <w:r>
         <w:rPr>
-          <w:rFonts w:ascii="Calibri" w:hAnsi="Calibri" w:eastAsia="ＭＳ 明朝" w:cs="Calibri" w:eastAsiaTheme="minorEastAsia" w:csTheme="minorBidi"/>
+          <w:rFonts w:ascii="Calibri" w:hAnsi="Calibri" w:eastAsia="ＭＳ 明朝" w:cs="Calibri" w:eastAsiaTheme="minorEastAsia"/>
           <w:sz w:val="22"/>
           <w:szCs w:val="22"/>
         </w:rPr>
@@ -315,7 +315,7 @@
       </w:pPr>
       <w:r>
         <w:rPr>
-          <w:rFonts w:ascii="Calibri" w:hAnsi="Calibri" w:eastAsia="ＭＳ 明朝" w:cs="Calibri" w:eastAsiaTheme="minorEastAsia" w:csTheme="minorBidi"/>
+          <w:rFonts w:ascii="Calibri" w:hAnsi="Calibri" w:eastAsia="ＭＳ 明朝" w:cs="Calibri" w:eastAsiaTheme="minorEastAsia"/>
           <w:sz w:val="22"/>
           <w:szCs w:val="22"/>
         </w:rPr>
@@ -329,7 +329,7 @@
       </w:pPr>
       <w:r>
         <w:rPr>
-          <w:rFonts w:ascii="Calibri" w:hAnsi="Calibri" w:eastAsia="ＭＳ ゴシック" w:cs="Calibri" w:asciiTheme="majorHAnsi" w:hAnsiTheme="majorHAnsi" w:eastAsiaTheme="majorEastAsia" w:csTheme="majorBidi"/>
+          <w:rFonts w:ascii="Calibri" w:hAnsi="Calibri" w:eastAsia="ＭＳ ゴシック" w:cs="Calibri" w:asciiTheme="majorHAnsi" w:hAnsiTheme="majorHAnsi" w:eastAsiaTheme="majorEastAsia"/>
           <w:b/>
           <w:bCs/>
           <w:color w:val="365F91" w:themeColor="accent1" w:themeShade="BF"/>
@@ -346,7 +346,7 @@
       </w:pPr>
       <w:r>
         <w:rPr>
-          <w:rFonts w:ascii="Calibri" w:hAnsi="Calibri" w:eastAsia="ＭＳ 明朝" w:cs="Calibri" w:eastAsiaTheme="minorEastAsia" w:csTheme="minorBidi"/>
+          <w:rFonts w:ascii="Calibri" w:hAnsi="Calibri" w:eastAsia="ＭＳ 明朝" w:cs="Calibri" w:eastAsiaTheme="minorEastAsia"/>
           <w:sz w:val="22"/>
           <w:szCs w:val="22"/>
         </w:rPr>
@@ -361,7 +361,7 @@
       </w:pPr>
       <w:r>
         <w:rPr>
-          <w:rFonts w:ascii="Calibri" w:hAnsi="Calibri" w:eastAsia="ＭＳ 明朝" w:cs="Calibri" w:eastAsiaTheme="minorEastAsia" w:csTheme="minorBidi"/>
+          <w:rFonts w:ascii="Calibri" w:hAnsi="Calibri" w:eastAsia="ＭＳ 明朝" w:cs="Calibri" w:eastAsiaTheme="minorEastAsia"/>
           <w:sz w:val="22"/>
           <w:szCs w:val="22"/>
         </w:rPr>
@@ -376,7 +376,7 @@
       </w:pPr>
       <w:r>
         <w:rPr>
-          <w:rFonts w:ascii="Calibri" w:hAnsi="Calibri" w:eastAsia="ＭＳ 明朝" w:cs="Calibri" w:eastAsiaTheme="minorEastAsia" w:csTheme="minorBidi"/>
+          <w:rFonts w:ascii="Calibri" w:hAnsi="Calibri" w:eastAsia="ＭＳ 明朝" w:cs="Calibri" w:eastAsiaTheme="minorEastAsia"/>
           <w:sz w:val="22"/>
           <w:szCs w:val="22"/>
         </w:rPr>
@@ -391,7 +391,7 @@
       </w:pPr>
       <w:r>
         <w:rPr>
-          <w:rFonts w:ascii="Calibri" w:hAnsi="Calibri" w:eastAsia="ＭＳ 明朝" w:cs="Calibri" w:eastAsiaTheme="minorEastAsia" w:csTheme="minorBidi"/>
+          <w:rFonts w:ascii="Calibri" w:hAnsi="Calibri" w:eastAsia="ＭＳ 明朝" w:cs="Calibri" w:eastAsiaTheme="minorEastAsia"/>
           <w:sz w:val="22"/>
           <w:szCs w:val="22"/>
         </w:rPr>
@@ -406,7 +406,7 @@
       </w:pPr>
       <w:r>
         <w:rPr>
-          <w:rFonts w:ascii="Calibri" w:hAnsi="Calibri" w:eastAsia="ＭＳ 明朝" w:cs="Calibri" w:eastAsiaTheme="minorEastAsia" w:csTheme="minorBidi"/>
+          <w:rFonts w:ascii="Calibri" w:hAnsi="Calibri" w:eastAsia="ＭＳ 明朝" w:cs="Calibri" w:eastAsiaTheme="minorEastAsia"/>
           <w:sz w:val="22"/>
           <w:szCs w:val="22"/>
         </w:rPr>
@@ -421,7 +421,7 @@
       </w:pPr>
       <w:r>
         <w:rPr>
-          <w:rFonts w:ascii="Calibri" w:hAnsi="Calibri" w:eastAsia="ＭＳ 明朝" w:cs="Calibri" w:eastAsiaTheme="minorEastAsia" w:csTheme="minorBidi"/>
+          <w:rFonts w:ascii="Calibri" w:hAnsi="Calibri" w:eastAsia="ＭＳ 明朝" w:cs="Calibri" w:eastAsiaTheme="minorEastAsia"/>
           <w:sz w:val="22"/>
           <w:szCs w:val="22"/>
         </w:rPr>
@@ -436,7 +436,7 @@
       </w:pPr>
       <w:r>
         <w:rPr>
-          <w:rFonts w:ascii="Calibri" w:hAnsi="Calibri" w:eastAsia="ＭＳ 明朝" w:cs="Calibri" w:eastAsiaTheme="minorEastAsia" w:csTheme="minorBidi"/>
+          <w:rFonts w:ascii="Calibri" w:hAnsi="Calibri" w:eastAsia="ＭＳ 明朝" w:cs="Calibri" w:eastAsiaTheme="minorEastAsia"/>
           <w:sz w:val="22"/>
           <w:szCs w:val="22"/>
         </w:rPr>
@@ -450,7 +450,7 @@
       </w:pPr>
       <w:r>
         <w:rPr>
-          <w:rFonts w:ascii="Calibri" w:hAnsi="Calibri" w:eastAsia="ＭＳ 明朝" w:cs="Calibri" w:eastAsiaTheme="minorEastAsia" w:csTheme="minorBidi"/>
+          <w:rFonts w:ascii="Calibri" w:hAnsi="Calibri" w:eastAsia="ＭＳ 明朝" w:cs="Calibri" w:eastAsiaTheme="minorEastAsia"/>
           <w:sz w:val="22"/>
           <w:szCs w:val="22"/>
         </w:rPr>
@@ -464,7 +464,7 @@
       </w:pPr>
       <w:r>
         <w:rPr>
-          <w:rFonts w:ascii="Calibri" w:hAnsi="Calibri" w:eastAsia="ＭＳ ゴシック" w:cs="Calibri" w:asciiTheme="majorHAnsi" w:hAnsiTheme="majorHAnsi" w:eastAsiaTheme="majorEastAsia" w:csTheme="majorBidi"/>
+          <w:rFonts w:ascii="Calibri" w:hAnsi="Calibri" w:eastAsia="ＭＳ ゴシック" w:cs="Calibri" w:asciiTheme="majorHAnsi" w:hAnsiTheme="majorHAnsi" w:eastAsiaTheme="majorEastAsia"/>
           <w:b/>
           <w:bCs/>
           <w:color w:val="365F91" w:themeColor="accent1" w:themeShade="BF"/>
@@ -481,7 +481,7 @@
       </w:pPr>
       <w:r>
         <w:rPr>
-          <w:rFonts w:ascii="Calibri" w:hAnsi="Calibri" w:eastAsia="ＭＳ 明朝" w:cs="Calibri" w:eastAsiaTheme="minorEastAsia" w:csTheme="minorBidi"/>
+          <w:rFonts w:ascii="Calibri" w:hAnsi="Calibri" w:eastAsia="ＭＳ 明朝" w:cs="Calibri" w:eastAsiaTheme="minorEastAsia"/>
           <w:sz w:val="22"/>
           <w:szCs w:val="22"/>
         </w:rPr>
@@ -495,7 +495,7 @@
       </w:pPr>
       <w:r>
         <w:rPr>
-          <w:rFonts w:ascii="Calibri" w:hAnsi="Calibri" w:eastAsia="ＭＳ 明朝" w:cs="Calibri" w:eastAsiaTheme="minorEastAsia" w:csTheme="minorBidi"/>
+          <w:rFonts w:ascii="Calibri" w:hAnsi="Calibri" w:eastAsia="ＭＳ 明朝" w:cs="Calibri" w:eastAsiaTheme="minorEastAsia"/>
           <w:sz w:val="22"/>
           <w:szCs w:val="22"/>
         </w:rPr>
@@ -509,7 +509,7 @@
       </w:pPr>
       <w:r>
         <w:rPr>
-          <w:rFonts w:ascii="Consolas" w:hAnsi="Consolas" w:eastAsia="ＭＳ 明朝" w:cs="Consolas" w:eastAsiaTheme="minorEastAsia" w:csTheme="minorBidi"/>
+          <w:rFonts w:ascii="Consolas" w:hAnsi="Consolas" w:eastAsia="ＭＳ 明朝" w:cs="Consolas" w:eastAsiaTheme="minorEastAsia"/>
           <w:sz w:val="18"/>
           <w:szCs w:val="22"/>
         </w:rPr>
@@ -520,7 +520,7 @@
       </w:r>
       <w:r>
         <w:rPr>
-          <w:rFonts w:ascii="Consolas" w:hAnsi="Consolas" w:eastAsia="ＭＳ 明朝" w:cs="Consolas" w:eastAsiaTheme="minorEastAsia" w:csTheme="minorBidi"/>
+          <w:rFonts w:ascii="Consolas" w:hAnsi="Consolas" w:eastAsia="ＭＳ 明朝" w:cs="Consolas" w:eastAsiaTheme="minorEastAsia"/>
           <w:sz w:val="18"/>
           <w:szCs w:val="22"/>
         </w:rPr>
@@ -531,7 +531,7 @@
       </w:r>
       <w:r>
         <w:rPr>
-          <w:rFonts w:ascii="Consolas" w:hAnsi="Consolas" w:eastAsia="ＭＳ 明朝" w:cs="Consolas" w:eastAsiaTheme="minorEastAsia" w:csTheme="minorBidi"/>
+          <w:rFonts w:ascii="Consolas" w:hAnsi="Consolas" w:eastAsia="ＭＳ 明朝" w:cs="Consolas" w:eastAsiaTheme="minorEastAsia"/>
           <w:sz w:val="18"/>
           <w:szCs w:val="22"/>
         </w:rPr>
@@ -542,7 +542,7 @@
       </w:r>
       <w:r>
         <w:rPr>
-          <w:rFonts w:ascii="Consolas" w:hAnsi="Consolas" w:eastAsia="ＭＳ 明朝" w:cs="Consolas" w:eastAsiaTheme="minorEastAsia" w:csTheme="minorBidi"/>
+          <w:rFonts w:ascii="Consolas" w:hAnsi="Consolas" w:eastAsia="ＭＳ 明朝" w:cs="Consolas" w:eastAsiaTheme="minorEastAsia"/>
           <w:sz w:val="18"/>
           <w:szCs w:val="22"/>
         </w:rPr>
@@ -553,7 +553,7 @@
       </w:r>
       <w:r>
         <w:rPr>
-          <w:rFonts w:ascii="Consolas" w:hAnsi="Consolas" w:eastAsia="ＭＳ 明朝" w:cs="Consolas" w:eastAsiaTheme="minorEastAsia" w:csTheme="minorBidi"/>
+          <w:rFonts w:ascii="Consolas" w:hAnsi="Consolas" w:eastAsia="ＭＳ 明朝" w:cs="Consolas" w:eastAsiaTheme="minorEastAsia"/>
           <w:sz w:val="18"/>
           <w:szCs w:val="22"/>
         </w:rPr>
@@ -564,7 +564,7 @@
       </w:r>
       <w:r>
         <w:rPr>
-          <w:rFonts w:ascii="Consolas" w:hAnsi="Consolas" w:eastAsia="ＭＳ 明朝" w:cs="Consolas" w:eastAsiaTheme="minorEastAsia" w:csTheme="minorBidi"/>
+          <w:rFonts w:ascii="Consolas" w:hAnsi="Consolas" w:eastAsia="ＭＳ 明朝" w:cs="Consolas" w:eastAsiaTheme="minorEastAsia"/>
           <w:sz w:val="18"/>
           <w:szCs w:val="22"/>
         </w:rPr>
@@ -575,7 +575,7 @@
       </w:r>
       <w:r>
         <w:rPr>
-          <w:rFonts w:ascii="Consolas" w:hAnsi="Consolas" w:eastAsia="ＭＳ 明朝" w:cs="Consolas" w:eastAsiaTheme="minorEastAsia" w:csTheme="minorBidi"/>
+          <w:rFonts w:ascii="Consolas" w:hAnsi="Consolas" w:eastAsia="ＭＳ 明朝" w:cs="Consolas" w:eastAsiaTheme="minorEastAsia"/>
           <w:sz w:val="18"/>
           <w:szCs w:val="22"/>
         </w:rPr>
@@ -586,7 +586,7 @@
       </w:r>
       <w:r>
         <w:rPr>
-          <w:rFonts w:ascii="Consolas" w:hAnsi="Consolas" w:eastAsia="ＭＳ 明朝" w:cs="Consolas" w:eastAsiaTheme="minorEastAsia" w:csTheme="minorBidi"/>
+          <w:rFonts w:ascii="Consolas" w:hAnsi="Consolas" w:eastAsia="ＭＳ 明朝" w:cs="Consolas" w:eastAsiaTheme="minorEastAsia"/>
           <w:sz w:val="18"/>
           <w:szCs w:val="22"/>
         </w:rPr>
@@ -597,7 +597,7 @@
       </w:r>
       <w:r>
         <w:rPr>
-          <w:rFonts w:ascii="Consolas" w:hAnsi="Consolas" w:eastAsia="ＭＳ 明朝" w:cs="Consolas" w:eastAsiaTheme="minorEastAsia" w:csTheme="minorBidi"/>
+          <w:rFonts w:ascii="Consolas" w:hAnsi="Consolas" w:eastAsia="ＭＳ 明朝" w:cs="Consolas" w:eastAsiaTheme="minorEastAsia"/>
           <w:sz w:val="18"/>
           <w:szCs w:val="22"/>
         </w:rPr>
@@ -608,7 +608,7 @@
       </w:r>
       <w:r>
         <w:rPr>
-          <w:rFonts w:ascii="Consolas" w:hAnsi="Consolas" w:eastAsia="ＭＳ 明朝" w:cs="Consolas" w:eastAsiaTheme="minorEastAsia" w:csTheme="minorBidi"/>
+          <w:rFonts w:ascii="Consolas" w:hAnsi="Consolas" w:eastAsia="ＭＳ 明朝" w:cs="Consolas" w:eastAsiaTheme="minorEastAsia"/>
           <w:sz w:val="18"/>
           <w:szCs w:val="22"/>
         </w:rPr>
@@ -619,7 +619,7 @@
       </w:r>
       <w:r>
         <w:rPr>
-          <w:rFonts w:ascii="Consolas" w:hAnsi="Consolas" w:eastAsia="ＭＳ 明朝" w:cs="Consolas" w:eastAsiaTheme="minorEastAsia" w:csTheme="minorBidi"/>
+          <w:rFonts w:ascii="Consolas" w:hAnsi="Consolas" w:eastAsia="ＭＳ 明朝" w:cs="Consolas" w:eastAsiaTheme="minorEastAsia"/>
           <w:sz w:val="18"/>
           <w:szCs w:val="22"/>
         </w:rPr>
@@ -633,7 +633,7 @@
       </w:pPr>
       <w:r>
         <w:rPr>
-          <w:rFonts w:ascii="Calibri" w:hAnsi="Calibri" w:eastAsia="ＭＳ ゴシック" w:cs="Calibri" w:asciiTheme="majorHAnsi" w:hAnsiTheme="majorHAnsi" w:eastAsiaTheme="majorEastAsia" w:csTheme="majorBidi"/>
+          <w:rFonts w:ascii="Calibri" w:hAnsi="Calibri" w:eastAsia="ＭＳ ゴシック" w:cs="Calibri" w:asciiTheme="majorHAnsi" w:hAnsiTheme="majorHAnsi" w:eastAsiaTheme="majorEastAsia"/>
           <w:b/>
           <w:bCs/>
           <w:color w:val="365F91" w:themeColor="accent1" w:themeShade="BF"/>
@@ -650,7 +650,7 @@
       </w:pPr>
       <w:r>
         <w:rPr>
-          <w:rFonts w:ascii="Calibri" w:hAnsi="Calibri" w:eastAsia="ＭＳ 明朝" w:cs="Calibri" w:eastAsiaTheme="minorEastAsia" w:csTheme="minorBidi"/>
+          <w:rFonts w:ascii="Calibri" w:hAnsi="Calibri" w:eastAsia="ＭＳ 明朝" w:cs="Calibri" w:eastAsiaTheme="minorEastAsia"/>
           <w:sz w:val="22"/>
           <w:szCs w:val="22"/>
         </w:rPr>
@@ -664,7 +664,7 @@
       </w:pPr>
       <w:r>
         <w:rPr>
-          <w:rFonts w:ascii="Calibri" w:hAnsi="Calibri" w:eastAsia="ＭＳ ゴシック" w:cs="Calibri" w:asciiTheme="majorHAnsi" w:hAnsiTheme="majorHAnsi" w:eastAsiaTheme="majorEastAsia" w:csTheme="majorBidi"/>
+          <w:rFonts w:ascii="Calibri" w:hAnsi="Calibri" w:eastAsia="ＭＳ ゴシック" w:cs="Calibri" w:asciiTheme="majorHAnsi" w:hAnsiTheme="majorHAnsi" w:eastAsiaTheme="majorEastAsia"/>
           <w:b/>
           <w:bCs/>
           <w:color w:val="4F81BD" w:themeColor="accent1"/>
@@ -681,7 +681,7 @@
       </w:pPr>
       <w:r>
         <w:rPr>
-          <w:rFonts w:ascii="Consolas" w:hAnsi="Consolas" w:eastAsia="ＭＳ 明朝" w:cs="Consolas" w:eastAsiaTheme="minorEastAsia" w:csTheme="minorBidi"/>
+          <w:rFonts w:ascii="Consolas" w:hAnsi="Consolas" w:eastAsia="ＭＳ 明朝" w:cs="Consolas" w:eastAsiaTheme="minorEastAsia"/>
           <w:sz w:val="18"/>
           <w:szCs w:val="22"/>
         </w:rPr>
@@ -692,7 +692,7 @@
       </w:r>
       <w:r>
         <w:rPr>
-          <w:rFonts w:ascii="Consolas" w:hAnsi="Consolas" w:eastAsia="ＭＳ 明朝" w:cs="Consolas" w:eastAsiaTheme="minorEastAsia" w:csTheme="minorBidi"/>
+          <w:rFonts w:ascii="Consolas" w:hAnsi="Consolas" w:eastAsia="ＭＳ 明朝" w:cs="Consolas" w:eastAsiaTheme="minorEastAsia"/>
           <w:sz w:val="18"/>
           <w:szCs w:val="22"/>
         </w:rPr>
@@ -703,7 +703,7 @@
       </w:r>
       <w:r>
         <w:rPr>
-          <w:rFonts w:ascii="Consolas" w:hAnsi="Consolas" w:eastAsia="ＭＳ 明朝" w:cs="Consolas" w:eastAsiaTheme="minorEastAsia" w:csTheme="minorBidi"/>
+          <w:rFonts w:ascii="Consolas" w:hAnsi="Consolas" w:eastAsia="ＭＳ 明朝" w:cs="Consolas" w:eastAsiaTheme="minorEastAsia"/>
           <w:sz w:val="18"/>
           <w:szCs w:val="22"/>
         </w:rPr>
@@ -714,7 +714,7 @@
       </w:r>
       <w:r>
         <w:rPr>
-          <w:rFonts w:ascii="Consolas" w:hAnsi="Consolas" w:eastAsia="ＭＳ 明朝" w:cs="Consolas" w:eastAsiaTheme="minorEastAsia" w:csTheme="minorBidi"/>
+          <w:rFonts w:ascii="Consolas" w:hAnsi="Consolas" w:eastAsia="ＭＳ 明朝" w:cs="Consolas" w:eastAsiaTheme="minorEastAsia"/>
           <w:sz w:val="18"/>
           <w:szCs w:val="22"/>
         </w:rPr>
@@ -725,7 +725,7 @@
       </w:r>
       <w:r>
         <w:rPr>
-          <w:rFonts w:ascii="Consolas" w:hAnsi="Consolas" w:eastAsia="ＭＳ 明朝" w:cs="Consolas" w:eastAsiaTheme="minorEastAsia" w:csTheme="minorBidi"/>
+          <w:rFonts w:ascii="Consolas" w:hAnsi="Consolas" w:eastAsia="ＭＳ 明朝" w:cs="Consolas" w:eastAsiaTheme="minorEastAsia"/>
           <w:sz w:val="18"/>
           <w:szCs w:val="22"/>
         </w:rPr>
@@ -739,7 +739,7 @@
       </w:pPr>
       <w:r>
         <w:rPr>
-          <w:rFonts w:ascii="Calibri" w:hAnsi="Calibri" w:eastAsia="ＭＳ ゴシック" w:cs="Calibri" w:asciiTheme="majorHAnsi" w:hAnsiTheme="majorHAnsi" w:eastAsiaTheme="majorEastAsia" w:csTheme="majorBidi"/>
+          <w:rFonts w:ascii="Calibri" w:hAnsi="Calibri" w:eastAsia="ＭＳ ゴシック" w:cs="Calibri" w:asciiTheme="majorHAnsi" w:hAnsiTheme="majorHAnsi" w:eastAsiaTheme="majorEastAsia"/>
           <w:b/>
           <w:bCs/>
           <w:color w:val="4F81BD" w:themeColor="accent1"/>
@@ -756,7 +756,7 @@
       </w:pPr>
       <w:r>
         <w:rPr>
-          <w:rFonts w:ascii="Consolas" w:hAnsi="Consolas" w:eastAsia="ＭＳ 明朝" w:cs="Consolas" w:eastAsiaTheme="minorEastAsia" w:csTheme="minorBidi"/>
+          <w:rFonts w:ascii="Consolas" w:hAnsi="Consolas" w:eastAsia="ＭＳ 明朝" w:cs="Consolas" w:eastAsiaTheme="minorEastAsia"/>
           <w:sz w:val="18"/>
           <w:szCs w:val="22"/>
         </w:rPr>
@@ -767,7 +767,7 @@
       </w:r>
       <w:r>
         <w:rPr>
-          <w:rFonts w:ascii="Consolas" w:hAnsi="Consolas" w:eastAsia="ＭＳ 明朝" w:cs="Consolas" w:eastAsiaTheme="minorEastAsia" w:csTheme="minorBidi"/>
+          <w:rFonts w:ascii="Consolas" w:hAnsi="Consolas" w:eastAsia="ＭＳ 明朝" w:cs="Consolas" w:eastAsiaTheme="minorEastAsia"/>
           <w:sz w:val="18"/>
           <w:szCs w:val="22"/>
         </w:rPr>
@@ -778,7 +778,7 @@
       </w:r>
       <w:r>
         <w:rPr>
-          <w:rFonts w:ascii="Consolas" w:hAnsi="Consolas" w:eastAsia="ＭＳ 明朝" w:cs="Consolas" w:eastAsiaTheme="minorEastAsia" w:csTheme="minorBidi"/>
+          <w:rFonts w:ascii="Consolas" w:hAnsi="Consolas" w:eastAsia="ＭＳ 明朝" w:cs="Consolas" w:eastAsiaTheme="minorEastAsia"/>
           <w:sz w:val="18"/>
           <w:szCs w:val="22"/>
         </w:rPr>
@@ -789,7 +789,7 @@
       </w:r>
       <w:r>
         <w:rPr>
-          <w:rFonts w:ascii="Consolas" w:hAnsi="Consolas" w:eastAsia="ＭＳ 明朝" w:cs="Consolas" w:eastAsiaTheme="minorEastAsia" w:csTheme="minorBidi"/>
+          <w:rFonts w:ascii="Consolas" w:hAnsi="Consolas" w:eastAsia="ＭＳ 明朝" w:cs="Consolas" w:eastAsiaTheme="minorEastAsia"/>
           <w:sz w:val="18"/>
           <w:szCs w:val="22"/>
         </w:rPr>
@@ -800,7 +800,7 @@
       </w:r>
       <w:r>
         <w:rPr>
-          <w:rFonts w:ascii="Consolas" w:hAnsi="Consolas" w:eastAsia="ＭＳ 明朝" w:cs="Consolas" w:eastAsiaTheme="minorEastAsia" w:csTheme="minorBidi"/>
+          <w:rFonts w:ascii="Consolas" w:hAnsi="Consolas" w:eastAsia="ＭＳ 明朝" w:cs="Consolas" w:eastAsiaTheme="minorEastAsia"/>
           <w:sz w:val="18"/>
           <w:szCs w:val="22"/>
         </w:rPr>
@@ -811,7 +811,7 @@
       </w:r>
       <w:r>
         <w:rPr>
-          <w:rFonts w:ascii="Consolas" w:hAnsi="Consolas" w:eastAsia="ＭＳ 明朝" w:cs="Consolas" w:eastAsiaTheme="minorEastAsia" w:csTheme="minorBidi"/>
+          <w:rFonts w:ascii="Consolas" w:hAnsi="Consolas" w:eastAsia="ＭＳ 明朝" w:cs="Consolas" w:eastAsiaTheme="minorEastAsia"/>
           <w:sz w:val="18"/>
           <w:szCs w:val="22"/>
         </w:rPr>
@@ -822,7 +822,7 @@
       </w:r>
       <w:r>
         <w:rPr>
-          <w:rFonts w:ascii="Consolas" w:hAnsi="Consolas" w:eastAsia="ＭＳ 明朝" w:cs="Consolas" w:eastAsiaTheme="minorEastAsia" w:csTheme="minorBidi"/>
+          <w:rFonts w:ascii="Consolas" w:hAnsi="Consolas" w:eastAsia="ＭＳ 明朝" w:cs="Consolas" w:eastAsiaTheme="minorEastAsia"/>
           <w:sz w:val="18"/>
           <w:szCs w:val="22"/>
         </w:rPr>
@@ -833,7 +833,7 @@
       </w:r>
       <w:r>
         <w:rPr>
-          <w:rFonts w:ascii="Consolas" w:hAnsi="Consolas" w:eastAsia="ＭＳ 明朝" w:cs="Consolas" w:eastAsiaTheme="minorEastAsia" w:csTheme="minorBidi"/>
+          <w:rFonts w:ascii="Consolas" w:hAnsi="Consolas" w:eastAsia="ＭＳ 明朝" w:cs="Consolas" w:eastAsiaTheme="minorEastAsia"/>
           <w:sz w:val="18"/>
           <w:szCs w:val="22"/>
         </w:rPr>
@@ -847,7 +847,7 @@
       </w:pPr>
       <w:r>
         <w:rPr>
-          <w:rFonts w:ascii="Calibri" w:hAnsi="Calibri" w:eastAsia="ＭＳ ゴシック" w:cs="Calibri" w:asciiTheme="majorHAnsi" w:hAnsiTheme="majorHAnsi" w:eastAsiaTheme="majorEastAsia" w:csTheme="majorBidi"/>
+          <w:rFonts w:ascii="Calibri" w:hAnsi="Calibri" w:eastAsia="ＭＳ ゴシック" w:cs="Calibri" w:asciiTheme="majorHAnsi" w:hAnsiTheme="majorHAnsi" w:eastAsiaTheme="majorEastAsia"/>
           <w:b/>
           <w:bCs/>
           <w:color w:val="4F81BD" w:themeColor="accent1"/>
@@ -864,7 +864,7 @@
       </w:pPr>
       <w:r>
         <w:rPr>
-          <w:rFonts w:ascii="Consolas" w:hAnsi="Consolas" w:eastAsia="ＭＳ 明朝" w:cs="Consolas" w:eastAsiaTheme="minorEastAsia" w:csTheme="minorBidi"/>
+          <w:rFonts w:ascii="Consolas" w:hAnsi="Consolas" w:eastAsia="ＭＳ 明朝" w:cs="Consolas" w:eastAsiaTheme="minorEastAsia"/>
           <w:sz w:val="18"/>
           <w:szCs w:val="22"/>
         </w:rPr>
@@ -875,7 +875,7 @@
       </w:r>
       <w:r>
         <w:rPr>
-          <w:rFonts w:ascii="Consolas" w:hAnsi="Consolas" w:eastAsia="ＭＳ 明朝" w:cs="Consolas" w:eastAsiaTheme="minorEastAsia" w:csTheme="minorBidi"/>
+          <w:rFonts w:ascii="Consolas" w:hAnsi="Consolas" w:eastAsia="ＭＳ 明朝" w:cs="Consolas" w:eastAsiaTheme="minorEastAsia"/>
           <w:sz w:val="18"/>
           <w:szCs w:val="22"/>
         </w:rPr>
@@ -886,7 +886,7 @@
       </w:r>
       <w:r>
         <w:rPr>
-          <w:rFonts w:ascii="Consolas" w:hAnsi="Consolas" w:eastAsia="ＭＳ 明朝" w:cs="Consolas" w:eastAsiaTheme="minorEastAsia" w:csTheme="minorBidi"/>
+          <w:rFonts w:ascii="Consolas" w:hAnsi="Consolas" w:eastAsia="ＭＳ 明朝" w:cs="Consolas" w:eastAsiaTheme="minorEastAsia"/>
           <w:sz w:val="18"/>
           <w:szCs w:val="22"/>
         </w:rPr>
@@ -897,7 +897,7 @@
       </w:r>
       <w:r>
         <w:rPr>
-          <w:rFonts w:ascii="Consolas" w:hAnsi="Consolas" w:eastAsia="ＭＳ 明朝" w:cs="Consolas" w:eastAsiaTheme="minorEastAsia" w:csTheme="minorBidi"/>
+          <w:rFonts w:ascii="Consolas" w:hAnsi="Consolas" w:eastAsia="ＭＳ 明朝" w:cs="Consolas" w:eastAsiaTheme="minorEastAsia"/>
           <w:sz w:val="18"/>
           <w:szCs w:val="22"/>
         </w:rPr>
@@ -908,7 +908,7 @@
       </w:r>
       <w:r>
         <w:rPr>
-          <w:rFonts w:ascii="Consolas" w:hAnsi="Consolas" w:eastAsia="ＭＳ 明朝" w:cs="Consolas" w:eastAsiaTheme="minorEastAsia" w:csTheme="minorBidi"/>
+          <w:rFonts w:ascii="Consolas" w:hAnsi="Consolas" w:eastAsia="ＭＳ 明朝" w:cs="Consolas" w:eastAsiaTheme="minorEastAsia"/>
           <w:sz w:val="18"/>
           <w:szCs w:val="22"/>
         </w:rPr>
@@ -922,7 +922,7 @@
       </w:pPr>
       <w:r>
         <w:rPr>
-          <w:rFonts w:ascii="Calibri" w:hAnsi="Calibri" w:eastAsia="ＭＳ ゴシック" w:cs="Calibri" w:asciiTheme="majorHAnsi" w:hAnsiTheme="majorHAnsi" w:eastAsiaTheme="majorEastAsia" w:csTheme="majorBidi"/>
+          <w:rFonts w:ascii="Calibri" w:hAnsi="Calibri" w:eastAsia="ＭＳ ゴシック" w:cs="Calibri" w:asciiTheme="majorHAnsi" w:hAnsiTheme="majorHAnsi" w:eastAsiaTheme="majorEastAsia"/>
           <w:b/>
           <w:bCs/>
           <w:color w:val="365F91" w:themeColor="accent1" w:themeShade="BF"/>
@@ -939,7 +939,7 @@
       </w:pPr>
       <w:r>
         <w:rPr>
-          <w:rFonts w:ascii="Calibri" w:hAnsi="Calibri" w:eastAsia="ＭＳ 明朝" w:cs="Calibri" w:eastAsiaTheme="minorEastAsia" w:csTheme="minorBidi"/>
+          <w:rFonts w:ascii="Calibri" w:hAnsi="Calibri" w:eastAsia="ＭＳ 明朝" w:cs="Calibri" w:eastAsiaTheme="minorEastAsia"/>
           <w:sz w:val="22"/>
           <w:szCs w:val="22"/>
         </w:rPr>
@@ -953,7 +953,7 @@
       </w:pPr>
       <w:r>
         <w:rPr>
-          <w:rFonts w:ascii="Consolas" w:hAnsi="Consolas" w:eastAsia="ＭＳ 明朝" w:cs="Consolas" w:eastAsiaTheme="minorEastAsia" w:csTheme="minorBidi"/>
+          <w:rFonts w:ascii="Consolas" w:hAnsi="Consolas" w:eastAsia="ＭＳ 明朝" w:cs="Consolas" w:eastAsiaTheme="minorEastAsia"/>
           <w:sz w:val="18"/>
           <w:szCs w:val="22"/>
         </w:rPr>
@@ -964,7 +964,7 @@
       </w:r>
       <w:r>
         <w:rPr>
-          <w:rFonts w:ascii="Consolas" w:hAnsi="Consolas" w:eastAsia="ＭＳ 明朝" w:cs="Consolas" w:eastAsiaTheme="minorEastAsia" w:csTheme="minorBidi"/>
+          <w:rFonts w:ascii="Consolas" w:hAnsi="Consolas" w:eastAsia="ＭＳ 明朝" w:cs="Consolas" w:eastAsiaTheme="minorEastAsia"/>
           <w:sz w:val="18"/>
           <w:szCs w:val="22"/>
         </w:rPr>
@@ -975,7 +975,7 @@
       </w:r>
       <w:r>
         <w:rPr>
-          <w:rFonts w:ascii="Consolas" w:hAnsi="Consolas" w:eastAsia="ＭＳ 明朝" w:cs="Consolas" w:eastAsiaTheme="minorEastAsia" w:csTheme="minorBidi"/>
+          <w:rFonts w:ascii="Consolas" w:hAnsi="Consolas" w:eastAsia="ＭＳ 明朝" w:cs="Consolas" w:eastAsiaTheme="minorEastAsia"/>
           <w:sz w:val="18"/>
           <w:szCs w:val="22"/>
         </w:rPr>
@@ -986,7 +986,7 @@
       </w:r>
       <w:r>
         <w:rPr>
-          <w:rFonts w:ascii="Consolas" w:hAnsi="Consolas" w:eastAsia="ＭＳ 明朝" w:cs="Consolas" w:eastAsiaTheme="minorEastAsia" w:csTheme="minorBidi"/>
+          <w:rFonts w:ascii="Consolas" w:hAnsi="Consolas" w:eastAsia="ＭＳ 明朝" w:cs="Consolas" w:eastAsiaTheme="minorEastAsia"/>
           <w:sz w:val="18"/>
           <w:szCs w:val="22"/>
         </w:rPr>
@@ -997,7 +997,7 @@
       </w:r>
       <w:r>
         <w:rPr>
-          <w:rFonts w:ascii="Consolas" w:hAnsi="Consolas" w:eastAsia="ＭＳ 明朝" w:cs="Consolas" w:eastAsiaTheme="minorEastAsia" w:csTheme="minorBidi"/>
+          <w:rFonts w:ascii="Consolas" w:hAnsi="Consolas" w:eastAsia="ＭＳ 明朝" w:cs="Consolas" w:eastAsiaTheme="minorEastAsia"/>
           <w:sz w:val="18"/>
           <w:szCs w:val="22"/>
         </w:rPr>
@@ -1008,7 +1008,7 @@
       </w:r>
       <w:r>
         <w:rPr>
-          <w:rFonts w:ascii="Consolas" w:hAnsi="Consolas" w:eastAsia="ＭＳ 明朝" w:cs="Consolas" w:eastAsiaTheme="minorEastAsia" w:csTheme="minorBidi"/>
+          <w:rFonts w:ascii="Consolas" w:hAnsi="Consolas" w:eastAsia="ＭＳ 明朝" w:cs="Consolas" w:eastAsiaTheme="minorEastAsia"/>
           <w:sz w:val="18"/>
           <w:szCs w:val="22"/>
         </w:rPr>
@@ -1019,7 +1019,7 @@
       </w:r>
       <w:r>
         <w:rPr>
-          <w:rFonts w:ascii="Consolas" w:hAnsi="Consolas" w:eastAsia="ＭＳ 明朝" w:cs="Consolas" w:eastAsiaTheme="minorEastAsia" w:csTheme="minorBidi"/>
+          <w:rFonts w:ascii="Consolas" w:hAnsi="Consolas" w:eastAsia="ＭＳ 明朝" w:cs="Consolas" w:eastAsiaTheme="minorEastAsia"/>
           <w:sz w:val="18"/>
           <w:szCs w:val="22"/>
         </w:rPr>
@@ -1033,7 +1033,7 @@
       </w:pPr>
       <w:r>
         <w:rPr>
-          <w:rFonts w:ascii="Calibri" w:hAnsi="Calibri" w:eastAsia="ＭＳ ゴシック" w:cs="Calibri" w:asciiTheme="majorHAnsi" w:hAnsiTheme="majorHAnsi" w:eastAsiaTheme="majorEastAsia" w:csTheme="majorBidi"/>
+          <w:rFonts w:ascii="Calibri" w:hAnsi="Calibri" w:eastAsia="ＭＳ ゴシック" w:cs="Calibri" w:asciiTheme="majorHAnsi" w:hAnsiTheme="majorHAnsi" w:eastAsiaTheme="majorEastAsia"/>
           <w:b/>
           <w:bCs/>
           <w:color w:val="365F91" w:themeColor="accent1" w:themeShade="BF"/>
@@ -1050,7 +1050,7 @@
       </w:pPr>
       <w:r>
         <w:rPr>
-          <w:rFonts w:ascii="Calibri" w:hAnsi="Calibri" w:eastAsia="ＭＳ 明朝" w:cs="Calibri" w:eastAsiaTheme="minorEastAsia" w:csTheme="minorBidi"/>
+          <w:rFonts w:ascii="Calibri" w:hAnsi="Calibri" w:eastAsia="ＭＳ 明朝" w:cs="Calibri" w:eastAsiaTheme="minorEastAsia"/>
           <w:sz w:val="22"/>
           <w:szCs w:val="22"/>
         </w:rPr>
@@ -1065,7 +1065,7 @@
       </w:pPr>
       <w:r>
         <w:rPr>
-          <w:rFonts w:ascii="Calibri" w:hAnsi="Calibri" w:eastAsia="ＭＳ 明朝" w:cs="Calibri" w:eastAsiaTheme="minorEastAsia" w:csTheme="minorBidi"/>
+          <w:rFonts w:ascii="Calibri" w:hAnsi="Calibri" w:eastAsia="ＭＳ 明朝" w:cs="Calibri" w:eastAsiaTheme="minorEastAsia"/>
           <w:sz w:val="22"/>
           <w:szCs w:val="22"/>
         </w:rPr>
@@ -1080,7 +1080,7 @@
       </w:pPr>
       <w:r>
         <w:rPr>
-          <w:rFonts w:ascii="Calibri" w:hAnsi="Calibri" w:eastAsia="ＭＳ 明朝" w:cs="Calibri" w:eastAsiaTheme="minorEastAsia" w:csTheme="minorBidi"/>
+          <w:rFonts w:ascii="Calibri" w:hAnsi="Calibri" w:eastAsia="ＭＳ 明朝" w:cs="Calibri" w:eastAsiaTheme="minorEastAsia"/>
           <w:sz w:val="22"/>
           <w:szCs w:val="22"/>
         </w:rPr>
@@ -1095,7 +1095,7 @@
       </w:pPr>
       <w:r>
         <w:rPr>
-          <w:rFonts w:ascii="Calibri" w:hAnsi="Calibri" w:eastAsia="ＭＳ 明朝" w:cs="Calibri" w:eastAsiaTheme="minorEastAsia" w:csTheme="minorBidi"/>
+          <w:rFonts w:ascii="Calibri" w:hAnsi="Calibri" w:eastAsia="ＭＳ 明朝" w:cs="Calibri" w:eastAsiaTheme="minorEastAsia"/>
           <w:sz w:val="22"/>
           <w:szCs w:val="22"/>
         </w:rPr>
@@ -1110,7 +1110,7 @@
       </w:pPr>
       <w:r>
         <w:rPr>
-          <w:rFonts w:ascii="Calibri" w:hAnsi="Calibri" w:eastAsia="ＭＳ 明朝" w:cs="Calibri" w:eastAsiaTheme="minorEastAsia" w:csTheme="minorBidi"/>
+          <w:rFonts w:ascii="Calibri" w:hAnsi="Calibri" w:eastAsia="ＭＳ 明朝" w:cs="Calibri" w:eastAsiaTheme="minorEastAsia"/>
           <w:sz w:val="22"/>
           <w:szCs w:val="22"/>
         </w:rPr>
@@ -1124,7 +1124,7 @@
       </w:pPr>
       <w:r>
         <w:rPr>
-          <w:rFonts w:ascii="Calibri" w:hAnsi="Calibri" w:eastAsia="ＭＳ ゴシック" w:cs="Calibri" w:asciiTheme="majorHAnsi" w:hAnsiTheme="majorHAnsi" w:eastAsiaTheme="majorEastAsia" w:csTheme="majorBidi"/>
+          <w:rFonts w:ascii="Calibri" w:hAnsi="Calibri" w:eastAsia="ＭＳ ゴシック" w:cs="Calibri" w:asciiTheme="majorHAnsi" w:hAnsiTheme="majorHAnsi" w:eastAsiaTheme="majorEastAsia"/>
           <w:b/>
           <w:bCs/>
           <w:color w:val="365F91" w:themeColor="accent1" w:themeShade="BF"/>
@@ -1141,7 +1141,7 @@
       </w:pPr>
       <w:r>
         <w:rPr>
-          <w:rFonts w:ascii="Calibri" w:hAnsi="Calibri" w:eastAsia="ＭＳ 明朝" w:cs="Calibri" w:eastAsiaTheme="minorEastAsia" w:csTheme="minorBidi"/>
+          <w:rFonts w:ascii="Calibri" w:hAnsi="Calibri" w:eastAsia="ＭＳ 明朝" w:cs="Calibri" w:eastAsiaTheme="minorEastAsia"/>
           <w:sz w:val="22"/>
           <w:szCs w:val="22"/>
         </w:rPr>
@@ -1156,7 +1156,7 @@
       </w:pPr>
       <w:r>
         <w:rPr>
-          <w:rFonts w:ascii="Calibri" w:hAnsi="Calibri" w:eastAsia="ＭＳ 明朝" w:cs="Calibri" w:eastAsiaTheme="minorEastAsia" w:csTheme="minorBidi"/>
+          <w:rFonts w:ascii="Calibri" w:hAnsi="Calibri" w:eastAsia="ＭＳ 明朝" w:cs="Calibri" w:eastAsiaTheme="minorEastAsia"/>
           <w:sz w:val="22"/>
           <w:szCs w:val="22"/>
         </w:rPr>
@@ -1171,7 +1171,7 @@
       </w:pPr>
       <w:r>
         <w:rPr>
-          <w:rFonts w:ascii="Calibri" w:hAnsi="Calibri" w:eastAsia="ＭＳ 明朝" w:cs="Calibri" w:eastAsiaTheme="minorEastAsia" w:csTheme="minorBidi"/>
+          <w:rFonts w:ascii="Calibri" w:hAnsi="Calibri" w:eastAsia="ＭＳ 明朝" w:cs="Calibri" w:eastAsiaTheme="minorEastAsia"/>
           <w:sz w:val="22"/>
           <w:szCs w:val="22"/>
         </w:rPr>
@@ -1186,7 +1186,7 @@
       </w:pPr>
       <w:r>
         <w:rPr>
-          <w:rFonts w:ascii="Calibri" w:hAnsi="Calibri" w:eastAsia="ＭＳ 明朝" w:cs="Calibri" w:eastAsiaTheme="minorEastAsia" w:csTheme="minorBidi"/>
+          <w:rFonts w:ascii="Calibri" w:hAnsi="Calibri" w:eastAsia="ＭＳ 明朝" w:cs="Calibri" w:eastAsiaTheme="minorEastAsia"/>
           <w:sz w:val="22"/>
           <w:szCs w:val="22"/>
         </w:rPr>
@@ -1201,7 +1201,7 @@
       </w:pPr>
       <w:r>
         <w:rPr>
-          <w:rFonts w:ascii="Calibri" w:hAnsi="Calibri" w:eastAsia="ＭＳ 明朝" w:cs="Calibri" w:eastAsiaTheme="minorEastAsia" w:csTheme="minorBidi"/>
+          <w:rFonts w:ascii="Calibri" w:hAnsi="Calibri" w:eastAsia="ＭＳ 明朝" w:cs="Calibri" w:eastAsiaTheme="minorEastAsia"/>
           <w:sz w:val="22"/>
           <w:szCs w:val="22"/>
         </w:rPr>
@@ -1216,7 +1216,7 @@
       </w:pPr>
       <w:r>
         <w:rPr>
-          <w:rFonts w:ascii="Calibri" w:hAnsi="Calibri" w:eastAsia="ＭＳ 明朝" w:cs="Calibri" w:eastAsiaTheme="minorEastAsia" w:csTheme="minorBidi"/>
+          <w:rFonts w:ascii="Calibri" w:hAnsi="Calibri" w:eastAsia="ＭＳ 明朝" w:cs="Calibri" w:eastAsiaTheme="minorEastAsia"/>
           <w:sz w:val="22"/>
           <w:szCs w:val="22"/>
         </w:rPr>
@@ -1231,7 +1231,7 @@
       </w:pPr>
       <w:r>
         <w:rPr>
-          <w:rFonts w:ascii="Calibri" w:hAnsi="Calibri" w:eastAsia="ＭＳ 明朝" w:cs="Calibri" w:eastAsiaTheme="minorEastAsia" w:csTheme="minorBidi"/>
+          <w:rFonts w:ascii="Calibri" w:hAnsi="Calibri" w:eastAsia="ＭＳ 明朝" w:cs="Calibri" w:eastAsiaTheme="minorEastAsia"/>
           <w:sz w:val="22"/>
           <w:szCs w:val="22"/>
         </w:rPr>
@@ -1246,7 +1246,7 @@
       </w:pPr>
       <w:r>
         <w:rPr>
-          <w:rFonts w:ascii="Calibri" w:hAnsi="Calibri" w:eastAsia="ＭＳ 明朝" w:cs="Calibri" w:eastAsiaTheme="minorEastAsia" w:csTheme="minorBidi"/>
+          <w:rFonts w:ascii="Calibri" w:hAnsi="Calibri" w:eastAsia="ＭＳ 明朝" w:cs="Calibri" w:eastAsiaTheme="minorEastAsia"/>
           <w:sz w:val="22"/>
           <w:szCs w:val="22"/>
         </w:rPr>
@@ -1261,7 +1261,7 @@
       </w:pPr>
       <w:r>
         <w:rPr>
-          <w:rFonts w:ascii="Calibri" w:hAnsi="Calibri" w:eastAsia="ＭＳ 明朝" w:cs="Calibri" w:eastAsiaTheme="minorEastAsia" w:csTheme="minorBidi"/>
+          <w:rFonts w:ascii="Calibri" w:hAnsi="Calibri" w:eastAsia="ＭＳ 明朝" w:cs="Calibri" w:eastAsiaTheme="minorEastAsia"/>
           <w:sz w:val="22"/>
           <w:szCs w:val="22"/>
         </w:rPr>
@@ -1276,7 +1276,7 @@
       </w:pPr>
       <w:r>
         <w:rPr>
-          <w:rFonts w:ascii="Calibri" w:hAnsi="Calibri" w:eastAsia="ＭＳ 明朝" w:cs="Calibri" w:eastAsiaTheme="minorEastAsia" w:csTheme="minorBidi"/>
+          <w:rFonts w:ascii="Calibri" w:hAnsi="Calibri" w:eastAsia="ＭＳ 明朝" w:cs="Calibri" w:eastAsiaTheme="minorEastAsia"/>
           <w:sz w:val="22"/>
           <w:szCs w:val="22"/>
         </w:rPr>
@@ -1291,7 +1291,7 @@
       </w:pPr>
       <w:r>
         <w:rPr>
-          <w:rFonts w:ascii="Calibri" w:hAnsi="Calibri" w:eastAsia="ＭＳ 明朝" w:cs="Calibri" w:eastAsiaTheme="minorEastAsia" w:csTheme="minorBidi"/>
+          <w:rFonts w:ascii="Calibri" w:hAnsi="Calibri" w:eastAsia="ＭＳ 明朝" w:cs="Calibri" w:eastAsiaTheme="minorEastAsia"/>
           <w:sz w:val="22"/>
           <w:szCs w:val="22"/>
         </w:rPr>
@@ -1305,7 +1305,7 @@
       </w:pPr>
       <w:r>
         <w:rPr>
-          <w:rFonts w:ascii="Calibri" w:hAnsi="Calibri" w:eastAsia="ＭＳ ゴシック" w:cs="Calibri" w:asciiTheme="majorHAnsi" w:hAnsiTheme="majorHAnsi" w:eastAsiaTheme="majorEastAsia" w:csTheme="majorBidi"/>
+          <w:rFonts w:ascii="Calibri" w:hAnsi="Calibri" w:eastAsia="ＭＳ ゴシック" w:cs="Calibri" w:asciiTheme="majorHAnsi" w:hAnsiTheme="majorHAnsi" w:eastAsiaTheme="majorEastAsia"/>
           <w:b/>
           <w:bCs/>
           <w:color w:val="365F91" w:themeColor="accent1" w:themeShade="BF"/>
@@ -1322,7 +1322,7 @@
       </w:pPr>
       <w:r>
         <w:rPr>
-          <w:rFonts w:ascii="Calibri" w:hAnsi="Calibri" w:eastAsia="ＭＳ 明朝" w:cs="Calibri" w:eastAsiaTheme="minorEastAsia" w:csTheme="minorBidi"/>
+          <w:rFonts w:ascii="Calibri" w:hAnsi="Calibri" w:eastAsia="ＭＳ 明朝" w:cs="Calibri" w:eastAsiaTheme="minorEastAsia"/>
           <w:sz w:val="22"/>
           <w:szCs w:val="22"/>
         </w:rPr>
@@ -1337,7 +1337,7 @@
       </w:pPr>
       <w:r>
         <w:rPr>
-          <w:rFonts w:ascii="Calibri" w:hAnsi="Calibri" w:eastAsia="ＭＳ 明朝" w:cs="Calibri" w:eastAsiaTheme="minorEastAsia" w:csTheme="minorBidi"/>
+          <w:rFonts w:ascii="Calibri" w:hAnsi="Calibri" w:eastAsia="ＭＳ 明朝" w:cs="Calibri" w:eastAsiaTheme="minorEastAsia"/>
           <w:sz w:val="22"/>
           <w:szCs w:val="22"/>
         </w:rPr>
@@ -1352,7 +1352,7 @@
       </w:pPr>
       <w:r>
         <w:rPr>
-          <w:rFonts w:ascii="Calibri" w:hAnsi="Calibri" w:eastAsia="ＭＳ 明朝" w:cs="Calibri" w:eastAsiaTheme="minorEastAsia" w:csTheme="minorBidi"/>
+          <w:rFonts w:ascii="Calibri" w:hAnsi="Calibri" w:eastAsia="ＭＳ 明朝" w:cs="Calibri" w:eastAsiaTheme="minorEastAsia"/>
           <w:sz w:val="22"/>
           <w:szCs w:val="22"/>
         </w:rPr>
@@ -1367,7 +1367,7 @@
       </w:pPr>
       <w:r>
         <w:rPr>
-          <w:rFonts w:ascii="Calibri" w:hAnsi="Calibri" w:eastAsia="ＭＳ 明朝" w:cs="Calibri" w:eastAsiaTheme="minorEastAsia" w:csTheme="minorBidi"/>
+          <w:rFonts w:ascii="Calibri" w:hAnsi="Calibri" w:eastAsia="ＭＳ 明朝" w:cs="Calibri" w:eastAsiaTheme="minorEastAsia"/>
           <w:sz w:val="22"/>
           <w:szCs w:val="22"/>
         </w:rPr>
@@ -1382,7 +1382,7 @@
       </w:pPr>
       <w:r>
         <w:rPr>
-          <w:rFonts w:ascii="Calibri" w:hAnsi="Calibri" w:eastAsia="ＭＳ 明朝" w:cs="Calibri" w:eastAsiaTheme="minorEastAsia" w:csTheme="minorBidi"/>
+          <w:rFonts w:ascii="Calibri" w:hAnsi="Calibri" w:eastAsia="ＭＳ 明朝" w:cs="Calibri" w:eastAsiaTheme="minorEastAsia"/>
           <w:sz w:val="22"/>
           <w:szCs w:val="22"/>
         </w:rPr>
@@ -1397,7 +1397,7 @@
       </w:pPr>
       <w:r>
         <w:rPr>
-          <w:rFonts w:ascii="Calibri" w:hAnsi="Calibri" w:eastAsia="ＭＳ 明朝" w:cs="Calibri" w:eastAsiaTheme="minorEastAsia" w:csTheme="minorBidi"/>
+          <w:rFonts w:ascii="Calibri" w:hAnsi="Calibri" w:eastAsia="ＭＳ 明朝" w:cs="Calibri" w:eastAsiaTheme="minorEastAsia"/>
           <w:sz w:val="22"/>
           <w:szCs w:val="22"/>
         </w:rPr>
@@ -1412,7 +1412,7 @@
       </w:pPr>
       <w:r>
         <w:rPr>
-          <w:rFonts w:ascii="Calibri" w:hAnsi="Calibri" w:eastAsia="ＭＳ 明朝" w:cs="Calibri" w:eastAsiaTheme="minorEastAsia" w:csTheme="minorBidi"/>
+          <w:rFonts w:ascii="Calibri" w:hAnsi="Calibri" w:eastAsia="ＭＳ 明朝" w:cs="Calibri" w:eastAsiaTheme="minorEastAsia"/>
           <w:sz w:val="22"/>
           <w:szCs w:val="22"/>
         </w:rPr>
@@ -1427,7 +1427,7 @@
       </w:pPr>
       <w:r>
         <w:rPr>
-          <w:rFonts w:ascii="Calibri" w:hAnsi="Calibri" w:eastAsia="ＭＳ 明朝" w:cs="Calibri" w:eastAsiaTheme="minorEastAsia" w:csTheme="minorBidi"/>
+          <w:rFonts w:ascii="Calibri" w:hAnsi="Calibri" w:eastAsia="ＭＳ 明朝" w:cs="Calibri" w:eastAsiaTheme="minorEastAsia"/>
           <w:sz w:val="22"/>
           <w:szCs w:val="22"/>
         </w:rPr>
@@ -1442,7 +1442,7 @@
       </w:pPr>
       <w:r>
         <w:rPr>
-          <w:rFonts w:ascii="Calibri" w:hAnsi="Calibri" w:eastAsia="ＭＳ 明朝" w:cs="Calibri" w:eastAsiaTheme="minorEastAsia" w:csTheme="minorBidi"/>
+          <w:rFonts w:ascii="Calibri" w:hAnsi="Calibri" w:eastAsia="ＭＳ 明朝" w:cs="Calibri" w:eastAsiaTheme="minorEastAsia"/>
           <w:sz w:val="22"/>
           <w:szCs w:val="22"/>
         </w:rPr>
@@ -1457,7 +1457,7 @@
       </w:pPr>
       <w:r>
         <w:rPr>
-          <w:rFonts w:ascii="Calibri" w:hAnsi="Calibri" w:eastAsia="ＭＳ 明朝" w:cs="Calibri" w:eastAsiaTheme="minorEastAsia" w:csTheme="minorBidi"/>
+          <w:rFonts w:ascii="Calibri" w:hAnsi="Calibri" w:eastAsia="ＭＳ 明朝" w:cs="Calibri" w:eastAsiaTheme="minorEastAsia"/>
           <w:sz w:val="22"/>
           <w:szCs w:val="22"/>
         </w:rPr>
@@ -1472,7 +1472,7 @@
       </w:pPr>
       <w:r>
         <w:rPr>
-          <w:rFonts w:ascii="Calibri" w:hAnsi="Calibri" w:eastAsia="ＭＳ 明朝" w:cs="Calibri" w:eastAsiaTheme="minorEastAsia" w:csTheme="minorBidi"/>
+          <w:rFonts w:ascii="Calibri" w:hAnsi="Calibri" w:eastAsia="ＭＳ 明朝" w:cs="Calibri" w:eastAsiaTheme="minorEastAsia"/>
           <w:sz w:val="22"/>
           <w:szCs w:val="22"/>
         </w:rPr>
@@ -1487,7 +1487,7 @@
       </w:pPr>
       <w:r>
         <w:rPr>
-          <w:rFonts w:ascii="Calibri" w:hAnsi="Calibri" w:eastAsia="ＭＳ 明朝" w:cs="Calibri" w:eastAsiaTheme="minorEastAsia" w:csTheme="minorBidi"/>
+          <w:rFonts w:ascii="Calibri" w:hAnsi="Calibri" w:eastAsia="ＭＳ 明朝" w:cs="Calibri" w:eastAsiaTheme="minorEastAsia"/>
           <w:sz w:val="22"/>
           <w:szCs w:val="22"/>
         </w:rPr>
@@ -1501,7 +1501,7 @@
       </w:pPr>
       <w:r>
         <w:rPr>
-          <w:rFonts w:ascii="Calibri" w:hAnsi="Calibri" w:eastAsia="ＭＳ 明朝" w:cs="Calibri" w:eastAsiaTheme="minorEastAsia" w:csTheme="minorBidi"/>
+          <w:rFonts w:ascii="Calibri" w:hAnsi="Calibri" w:eastAsia="ＭＳ 明朝" w:cs="Calibri" w:eastAsiaTheme="minorEastAsia"/>
           <w:sz w:val="22"/>
           <w:szCs w:val="22"/>
         </w:rPr>
@@ -1515,7 +1515,7 @@
       </w:pPr>
       <w:r>
         <w:rPr>
-          <w:rFonts w:ascii="Consolas" w:hAnsi="Consolas" w:eastAsia="ＭＳ 明朝" w:cs="Consolas" w:eastAsiaTheme="minorEastAsia" w:csTheme="minorBidi"/>
+          <w:rFonts w:ascii="Consolas" w:hAnsi="Consolas" w:eastAsia="ＭＳ 明朝" w:cs="Consolas" w:eastAsiaTheme="minorEastAsia"/>
           <w:sz w:val="18"/>
           <w:szCs w:val="22"/>
         </w:rPr>
@@ -1526,7 +1526,7 @@
       </w:r>
       <w:r>
         <w:rPr>
-          <w:rFonts w:ascii="Consolas" w:hAnsi="Consolas" w:eastAsia="ＭＳ 明朝" w:cs="Consolas" w:eastAsiaTheme="minorEastAsia" w:csTheme="minorBidi"/>
+          <w:rFonts w:ascii="Consolas" w:hAnsi="Consolas" w:eastAsia="ＭＳ 明朝" w:cs="Consolas" w:eastAsiaTheme="minorEastAsia"/>
           <w:sz w:val="18"/>
           <w:szCs w:val="22"/>
         </w:rPr>
@@ -1537,7 +1537,7 @@
       </w:r>
       <w:r>
         <w:rPr>
-          <w:rFonts w:ascii="Consolas" w:hAnsi="Consolas" w:eastAsia="ＭＳ 明朝" w:cs="Consolas" w:eastAsiaTheme="minorEastAsia" w:csTheme="minorBidi"/>
+          <w:rFonts w:ascii="Consolas" w:hAnsi="Consolas" w:eastAsia="ＭＳ 明朝" w:cs="Consolas" w:eastAsiaTheme="minorEastAsia"/>
           <w:sz w:val="18"/>
           <w:szCs w:val="22"/>
         </w:rPr>
@@ -1548,7 +1548,7 @@
       </w:r>
       <w:r>
         <w:rPr>
-          <w:rFonts w:ascii="Consolas" w:hAnsi="Consolas" w:eastAsia="ＭＳ 明朝" w:cs="Consolas" w:eastAsiaTheme="minorEastAsia" w:csTheme="minorBidi"/>
+          <w:rFonts w:ascii="Consolas" w:hAnsi="Consolas" w:eastAsia="ＭＳ 明朝" w:cs="Consolas" w:eastAsiaTheme="minorEastAsia"/>
           <w:sz w:val="18"/>
           <w:szCs w:val="22"/>
         </w:rPr>
@@ -1559,7 +1559,7 @@
       </w:r>
       <w:r>
         <w:rPr>
-          <w:rFonts w:ascii="Consolas" w:hAnsi="Consolas" w:eastAsia="ＭＳ 明朝" w:cs="Consolas" w:eastAsiaTheme="minorEastAsia" w:csTheme="minorBidi"/>
+          <w:rFonts w:ascii="Consolas" w:hAnsi="Consolas" w:eastAsia="ＭＳ 明朝" w:cs="Consolas" w:eastAsiaTheme="minorEastAsia"/>
           <w:sz w:val="18"/>
           <w:szCs w:val="22"/>
         </w:rPr>
@@ -1570,7 +1570,7 @@
       </w:r>
       <w:r>
         <w:rPr>
-          <w:rFonts w:ascii="Consolas" w:hAnsi="Consolas" w:eastAsia="ＭＳ 明朝" w:cs="Consolas" w:eastAsiaTheme="minorEastAsia" w:csTheme="minorBidi"/>
+          <w:rFonts w:ascii="Consolas" w:hAnsi="Consolas" w:eastAsia="ＭＳ 明朝" w:cs="Consolas" w:eastAsiaTheme="minorEastAsia"/>
           <w:sz w:val="18"/>
           <w:szCs w:val="22"/>
         </w:rPr>
@@ -1581,7 +1581,7 @@
       </w:r>
       <w:r>
         <w:rPr>
-          <w:rFonts w:ascii="Consolas" w:hAnsi="Consolas" w:eastAsia="ＭＳ 明朝" w:cs="Consolas" w:eastAsiaTheme="minorEastAsia" w:csTheme="minorBidi"/>
+          <w:rFonts w:ascii="Consolas" w:hAnsi="Consolas" w:eastAsia="ＭＳ 明朝" w:cs="Consolas" w:eastAsiaTheme="minorEastAsia"/>
           <w:sz w:val="18"/>
           <w:szCs w:val="22"/>
         </w:rPr>
@@ -1592,7 +1592,7 @@
       </w:r>
       <w:r>
         <w:rPr>
-          <w:rFonts w:ascii="Consolas" w:hAnsi="Consolas" w:eastAsia="ＭＳ 明朝" w:cs="Consolas" w:eastAsiaTheme="minorEastAsia" w:csTheme="minorBidi"/>
+          <w:rFonts w:ascii="Consolas" w:hAnsi="Consolas" w:eastAsia="ＭＳ 明朝" w:cs="Consolas" w:eastAsiaTheme="minorEastAsia"/>
           <w:sz w:val="18"/>
           <w:szCs w:val="22"/>
         </w:rPr>
@@ -1603,7 +1603,7 @@
       </w:r>
       <w:r>
         <w:rPr>
-          <w:rFonts w:ascii="Consolas" w:hAnsi="Consolas" w:eastAsia="ＭＳ 明朝" w:cs="Consolas" w:eastAsiaTheme="minorEastAsia" w:csTheme="minorBidi"/>
+          <w:rFonts w:ascii="Consolas" w:hAnsi="Consolas" w:eastAsia="ＭＳ 明朝" w:cs="Consolas" w:eastAsiaTheme="minorEastAsia"/>
           <w:sz w:val="18"/>
           <w:szCs w:val="22"/>
         </w:rPr>
@@ -1617,7 +1617,7 @@
       </w:pPr>
       <w:r>
         <w:rPr>
-          <w:rFonts w:ascii="Calibri" w:hAnsi="Calibri" w:eastAsia="ＭＳ 明朝" w:cs="Calibri" w:eastAsiaTheme="minorEastAsia" w:csTheme="minorBidi"/>
+          <w:rFonts w:ascii="Calibri" w:hAnsi="Calibri" w:eastAsia="ＭＳ 明朝" w:cs="Calibri" w:eastAsiaTheme="minorEastAsia"/>
           <w:sz w:val="22"/>
           <w:szCs w:val="22"/>
         </w:rPr>
@@ -1637,72 +1637,66 @@
 </file>
 
 <file path=word/header1.xml><?xml version="1.0" encoding="utf-8"?>
-<ns0:hdr xmlns:ns0="http://schemas.openxmlformats.org/wordprocessingml/2006/main" xmlns:ns1="http://schemas.microsoft.com/office/word/2010/wordml">
-  <ns0:p ns1:paraId="24BB0033">
-    <ns0:pPr>
-      <ns0:spacing ns0:after="200" ns0:line="276" ns0:lineRule="auto"/>
-    </ns0:pPr>
-    <ns0:r>
-      <ns0:t>Nama : Raka Arwaky</ns0:t>
-    </ns0:r>
-    <ns0:r>
-      <ns0:tab/>
-    </ns0:r>
-    <ns0:r>
-      <ns0:tab/>
-    </ns0:r>
-    <ns0:r>
-      <ns0:tab/>
-    </ns0:r>
-    <ns0:r>
-      <ns0:tab/>
-    </ns0:r>
-    <ns0:r>
-      <ns0:tab/>
-    </ns0:r>
-    <ns0:r>
-      <ns0:t>Mata Kuliah : Pengantar Coding</ns0:t>
-    </ns0:r>
-  </ns0:p>
-  <ns0:p ns1:paraId="37AC61F8">
-    <ns0:pPr>
-      <ns0:spacing ns0:after="200" ns0:line="276" ns0:lineRule="auto"/>
-    </ns0:pPr>
-    <ns0:r>
-      <ns0:t xml:space="preserve">Nim    : 22342030</ns0:t>
-    </ns0:r>
-    <ns0:r>
-      <ns0:tab/>
-    </ns0:r>
-    <ns0:r>
-      <ns0:tab/>
-    </ns0:r>
-    <ns0:r>
-      <ns0:tab/>
-    </ns0:r>
-    <ns0:r>
-      <ns0:tab/>
-    </ns0:r>
-    <ns0:r>
-      <ns0:tab/>
-    </ns0:r>
-    <ns0:r>
-      <ns0:tab/>
-    </ns0:r>
-    <ns0:r>
-      <ns0:t>Sesi : 863</ns0:t>
-    </ns0:r>
-  </ns0:p>
-  <ns0:p ns1:paraId="75C8E359">
-    <ns0:pPr>
-      <ns0:spacing ns0:after="200" ns0:line="276" ns0:lineRule="auto"/>
-    </ns0:pPr>
-  </ns0:p>
-</ns0:hdr>
+<w:hdr xmlns:wpc="http://schemas.microsoft.com/office/word/2010/wordprocessingCanvas" xmlns:mc="http://schemas.openxmlformats.org/markup-compatibility/2006" xmlns:o="urn:schemas-microsoft-com:office:office" xmlns:r="http://schemas.openxmlformats.org/officeDocument/2006/relationships" xmlns:m="http://schemas.openxmlformats.org/officeDocument/2006/math" xmlns:v="urn:schemas-microsoft-com:vml" xmlns:wp14="http://schemas.microsoft.com/office/word/2010/wordprocessingDrawing" xmlns:wp="http://schemas.openxmlformats.org/drawingml/2006/wordprocessingDrawing" xmlns:w10="urn:schemas-microsoft-com:office:word" xmlns:w="http://schemas.openxmlformats.org/wordprocessingml/2006/main" xmlns:w14="http://schemas.microsoft.com/office/word/2010/wordml" xmlns:w15="http://schemas.microsoft.com/office/word/2012/wordml" xmlns:w16se="http://schemas.microsoft.com/office/word/2015/wordml/symex" xmlns:w16cid="http://schemas.microsoft.com/office/word/2016/wordml/cid" xmlns:w16="http://schemas.microsoft.com/office/word/2018/wordml" xmlns:w16cex="http://schemas.microsoft.com/office/word/2018/wordml/cex" xmlns:w16sdtdh="http://schemas.microsoft.com/office/word/2020/wordml/sdtdatahash" xmlns:wne="http://schemas.microsoft.com/office/word/2006/wordml" xmlns:wpg="http://schemas.microsoft.com/office/word/2010/wordprocessingGroup" xmlns:wps="http://schemas.microsoft.com/office/word/2010/wordprocessingShape">
+  <w:p>
+    <w:r>
+      <w:t>Nama : Raka Arwaky</w:t>
+    </w:r>
+    <w:r>
+      <w:tab/>
+    </w:r>
+    <w:r>
+      <w:tab/>
+    </w:r>
+    <w:r>
+      <w:tab/>
+    </w:r>
+    <w:r>
+      <w:tab/>
+    </w:r>
+    <w:r>
+      <w:tab/>
+    </w:r>
+    <w:r>
+      <w:t>Mata Kuliah : Pengantar Coding</w:t>
+    </w:r>
+  </w:p>
+  <w:p>
+    <w:r>
+      <w:t xml:space="preserve">Nim    : 22342030</w:t>
+    </w:r>
+    <w:r>
+      <w:tab/>
+    </w:r>
+    <w:r>
+      <w:tab/>
+    </w:r>
+    <w:r>
+      <w:tab/>
+    </w:r>
+    <w:r>
+      <w:tab/>
+    </w:r>
+    <w:r>
+      <w:tab/>
+    </w:r>
+    <w:r>
+      <w:tab/>
+    </w:r>
+    <w:r>
+      <w:t>Sesi : 863</w:t>
+    </w:r>
+  </w:p>
+  <w:p/>
+</w:hdr>
 </file>
 
 <file path=word/header2.xml><?xml version="1.0" encoding="utf-8"?>
-<ns0:hdr xmlns:ns0="http://schemas.openxmlformats.org/wordprocessingml/2006/main" xmlns:ns1="http://schemas.openxmlformats.org/markup-compatibility/2006" ns1:Ignorable="w14 wp14"/>
+<w:hdr xmlns:wpc="http://schemas.microsoft.com/office/word/2010/wordprocessingCanvas" xmlns:mc="http://schemas.openxmlformats.org/markup-compatibility/2006" xmlns:o="urn:schemas-microsoft-com:office:office" xmlns:r="http://schemas.openxmlformats.org/officeDocument/2006/relationships" xmlns:m="http://schemas.openxmlformats.org/officeDocument/2006/math" xmlns:v="urn:schemas-microsoft-com:vml" xmlns:wp14="http://schemas.microsoft.com/office/word/2010/wordprocessingDrawing" xmlns:wp="http://schemas.openxmlformats.org/drawingml/2006/wordprocessingDrawing" xmlns:w10="urn:schemas-microsoft-com:office:word" xmlns:w="http://schemas.openxmlformats.org/wordprocessingml/2006/main" xmlns:w14="http://schemas.microsoft.com/office/word/2010/wordml" xmlns:w15="http://schemas.microsoft.com/office/word/2012/wordml" xmlns:w16se="http://schemas.microsoft.com/office/word/2015/wordml/symex" xmlns:w16cid="http://schemas.microsoft.com/office/word/2016/wordml/cid" xmlns:w16="http://schemas.microsoft.com/office/word/2018/wordml" xmlns:w16cex="http://schemas.microsoft.com/office/word/2018/wordml/cex" xmlns:w16sdtdh="http://schemas.microsoft.com/office/word/2020/wordml/sdtdatahash" xmlns:wne="http://schemas.microsoft.com/office/word/2006/wordml" xmlns:wpg="http://schemas.microsoft.com/office/word/2010/wordprocessingGroup" xmlns:wps="http://schemas.microsoft.com/office/word/2010/wordprocessingShape">
+  <w:p>
+    <w:pPr/>
+  </w:p>
+</w:hdr>
 </file>
 
 <file path=word/numbering.xml><?xml version="1.0" encoding="utf-8"?>

</xml_diff>